<commit_message>
Se modifica el problemario editable y por ende el pdf
</commit_message>
<xml_diff>
--- a/U1/U1-Problemario.docx
+++ b/U1/U1-Problemario.docx
@@ -512,6 +512,9 @@
     </w:p>
     <w:p>
       <w:r>
+        <w:rPr>
+          <w:noProof/>
+        </w:rPr>
         <w:lastRenderedPageBreak/>
         <w:drawing>
           <wp:anchor distT="0" distB="0" distL="114300" distR="114300" simplePos="0" relativeHeight="251662336" behindDoc="1" locked="0" layoutInCell="1" allowOverlap="1" wp14:anchorId="1DC7D372" wp14:editId="71CE3D1A">
@@ -667,10 +670,7 @@
                               <w:t>:</w:t>
                             </w:r>
                             <w:r>
-                              <w:t xml:space="preserve"> </w:t>
-                            </w:r>
-                            <w:r>
-                              <w:t>Captura del código del ejercicio 1.</w:t>
+                              <w:t xml:space="preserve"> Captura del código del ejercicio 1.</w:t>
                             </w:r>
                           </w:p>
                         </w:txbxContent>
@@ -747,10 +747,7 @@
                         <w:t>:</w:t>
                       </w:r>
                       <w:r>
-                        <w:t xml:space="preserve"> </w:t>
-                      </w:r>
-                      <w:r>
-                        <w:t>Captura del código del ejercicio 1.</w:t>
+                        <w:t xml:space="preserve"> Captura del código del ejercicio 1.</w:t>
                       </w:r>
                     </w:p>
                   </w:txbxContent>
@@ -961,6 +958,9 @@
         </mc:AlternateContent>
       </w:r>
       <w:r>
+        <w:rPr>
+          <w:noProof/>
+        </w:rPr>
         <w:drawing>
           <wp:anchor distT="0" distB="0" distL="114300" distR="114300" simplePos="0" relativeHeight="251664384" behindDoc="0" locked="0" layoutInCell="1" allowOverlap="1" wp14:anchorId="548B0D84" wp14:editId="23EF8073">
             <wp:simplePos x="0" y="0"/>
@@ -1020,10 +1020,7 @@
         <w:t>)</w:t>
       </w:r>
       <w:r>
-        <w:t xml:space="preserve"> El encabezado en la consola</w:t>
-      </w:r>
-      <w:r>
-        <w:t>.</w:t>
+        <w:t xml:space="preserve"> El encabezado en la consola.</w:t>
       </w:r>
     </w:p>
     <w:p>
@@ -1035,13 +1032,7 @@
         <w:t>7)</w:t>
       </w:r>
       <w:r>
-        <w:t xml:space="preserve"> </w:t>
-      </w:r>
-      <w:r>
-        <w:t>Evidencia de ejecución en Visual Studio</w:t>
-      </w:r>
-      <w:r>
-        <w:t xml:space="preserve"> &amp; </w:t>
+        <w:t xml:space="preserve"> Evidencia de ejecución en Visual Studio &amp; </w:t>
       </w:r>
       <w:r>
         <w:rPr>
@@ -1265,6 +1256,9 @@
               </mc:AlternateContent>
             </w:r>
             <w:r>
+              <w:rPr>
+                <w:noProof/>
+              </w:rPr>
               <w:drawing>
                 <wp:anchor distT="0" distB="0" distL="114300" distR="114300" simplePos="0" relativeHeight="251674624" behindDoc="0" locked="0" layoutInCell="1" allowOverlap="1" wp14:anchorId="24292623" wp14:editId="4D3989F5">
                   <wp:simplePos x="0" y="0"/>
@@ -1548,6 +1542,9 @@
               </mc:AlternateContent>
             </w:r>
             <w:r>
+              <w:rPr>
+                <w:noProof/>
+              </w:rPr>
               <w:drawing>
                 <wp:anchor distT="0" distB="0" distL="114300" distR="114300" simplePos="0" relativeHeight="251677696" behindDoc="0" locked="0" layoutInCell="1" allowOverlap="1" wp14:anchorId="34D6F7AD" wp14:editId="343AE0A3">
                   <wp:simplePos x="0" y="0"/>
@@ -1612,10 +1609,7 @@
         <w:t>)</w:t>
       </w:r>
       <w:r>
-        <w:t xml:space="preserve"> </w:t>
-      </w:r>
-      <w:r>
-        <w:t>Conclusión.</w:t>
+        <w:t xml:space="preserve"> Conclusión.</w:t>
       </w:r>
     </w:p>
     <w:p>
@@ -1964,6 +1958,9 @@
     </w:p>
     <w:p>
       <w:r>
+        <w:rPr>
+          <w:noProof/>
+        </w:rPr>
         <w:lastRenderedPageBreak/>
         <w:drawing>
           <wp:anchor distT="0" distB="0" distL="114300" distR="114300" simplePos="0" relativeHeight="251691008" behindDoc="0" locked="0" layoutInCell="1" allowOverlap="1" wp14:anchorId="1C955EC1" wp14:editId="26F6DB62">
@@ -2432,6 +2429,9 @@
         </mc:AlternateContent>
       </w:r>
       <w:r>
+        <w:rPr>
+          <w:noProof/>
+        </w:rPr>
         <w:drawing>
           <wp:anchor distT="0" distB="0" distL="114300" distR="114300" simplePos="0" relativeHeight="251693056" behindDoc="0" locked="0" layoutInCell="1" allowOverlap="1" wp14:anchorId="473E538A" wp14:editId="3E7C0B37">
             <wp:simplePos x="0" y="0"/>
@@ -2540,6 +2540,9 @@
           </w:tcPr>
           <w:p>
             <w:r>
+              <w:rPr>
+                <w:noProof/>
+              </w:rPr>
               <w:drawing>
                 <wp:anchor distT="0" distB="0" distL="114300" distR="114300" simplePos="0" relativeHeight="251695104" behindDoc="0" locked="0" layoutInCell="1" allowOverlap="1" wp14:anchorId="545D6A46" wp14:editId="279EB370">
                   <wp:simplePos x="0" y="0"/>
@@ -2995,6 +2998,9 @@
               </mc:AlternateContent>
             </w:r>
             <w:r>
+              <w:rPr>
+                <w:noProof/>
+              </w:rPr>
               <w:drawing>
                 <wp:anchor distT="0" distB="0" distL="114300" distR="114300" simplePos="0" relativeHeight="251703296" behindDoc="0" locked="0" layoutInCell="1" allowOverlap="1" wp14:anchorId="62D0F403" wp14:editId="01D32962">
                   <wp:simplePos x="0" y="0"/>
@@ -3632,6 +3638,9 @@
         </mc:AlternateContent>
       </w:r>
       <w:r>
+        <w:rPr>
+          <w:noProof/>
+        </w:rPr>
         <w:drawing>
           <wp:anchor distT="0" distB="0" distL="114300" distR="114300" simplePos="0" relativeHeight="251716608" behindDoc="0" locked="0" layoutInCell="1" allowOverlap="1" wp14:anchorId="44F07217" wp14:editId="332E1F6A">
             <wp:simplePos x="0" y="0"/>
@@ -3891,6 +3900,9 @@
         </mc:AlternateContent>
       </w:r>
       <w:r>
+        <w:rPr>
+          <w:noProof/>
+        </w:rPr>
         <w:drawing>
           <wp:anchor distT="0" distB="0" distL="114300" distR="114300" simplePos="0" relativeHeight="251720704" behindDoc="0" locked="0" layoutInCell="1" allowOverlap="1" wp14:anchorId="4B90A9BE" wp14:editId="439A0F96">
             <wp:simplePos x="0" y="0"/>
@@ -4204,6 +4216,9 @@
               </mc:AlternateContent>
             </w:r>
             <w:r>
+              <w:rPr>
+                <w:noProof/>
+              </w:rPr>
               <w:drawing>
                 <wp:anchor distT="0" distB="0" distL="114300" distR="114300" simplePos="0" relativeHeight="251724800" behindDoc="0" locked="0" layoutInCell="1" allowOverlap="1" wp14:anchorId="7BB4331E" wp14:editId="48B7100C">
                   <wp:simplePos x="0" y="0"/>
@@ -4460,6 +4475,9 @@
               </mc:AlternateContent>
             </w:r>
             <w:r>
+              <w:rPr>
+                <w:noProof/>
+              </w:rPr>
               <w:drawing>
                 <wp:anchor distT="0" distB="0" distL="114300" distR="114300" simplePos="0" relativeHeight="251728896" behindDoc="0" locked="0" layoutInCell="1" allowOverlap="1" wp14:anchorId="72B4E65C" wp14:editId="7374FE78">
                   <wp:simplePos x="0" y="0"/>
@@ -5170,6 +5188,9 @@
         </mc:AlternateContent>
       </w:r>
       <w:r>
+        <w:rPr>
+          <w:noProof/>
+        </w:rPr>
         <w:drawing>
           <wp:anchor distT="0" distB="0" distL="114300" distR="114300" simplePos="0" relativeHeight="251742208" behindDoc="0" locked="0" layoutInCell="1" allowOverlap="1" wp14:anchorId="370ED2D2" wp14:editId="6D328891">
             <wp:simplePos x="0" y="0"/>
@@ -5619,6 +5640,9 @@
         </mc:AlternateContent>
       </w:r>
       <w:r>
+        <w:rPr>
+          <w:noProof/>
+        </w:rPr>
         <w:drawing>
           <wp:anchor distT="0" distB="0" distL="114300" distR="114300" simplePos="0" relativeHeight="251746304" behindDoc="0" locked="0" layoutInCell="1" allowOverlap="1" wp14:anchorId="79E048B6" wp14:editId="13FCD448">
             <wp:simplePos x="0" y="0"/>
@@ -5941,6 +5965,9 @@
               </mc:AlternateContent>
             </w:r>
             <w:r>
+              <w:rPr>
+                <w:noProof/>
+              </w:rPr>
               <w:drawing>
                 <wp:anchor distT="0" distB="0" distL="114300" distR="114300" simplePos="0" relativeHeight="251750400" behindDoc="0" locked="0" layoutInCell="1" allowOverlap="1" wp14:anchorId="1A42A651" wp14:editId="4CC31072">
                   <wp:simplePos x="0" y="0"/>
@@ -6211,7 +6238,7 @@
                 <w:noProof/>
               </w:rPr>
               <w:drawing>
-                <wp:anchor distT="0" distB="0" distL="114300" distR="114300" simplePos="0" relativeHeight="251753472" behindDoc="0" locked="0" layoutInCell="1" allowOverlap="1" wp14:anchorId="16749F2A" wp14:editId="465F0458">
+                <wp:anchor distT="0" distB="0" distL="114300" distR="114300" simplePos="0" relativeHeight="251753472" behindDoc="0" locked="0" layoutInCell="1" allowOverlap="1" wp14:anchorId="16749F2A" wp14:editId="7A4E2750">
                   <wp:simplePos x="0" y="0"/>
                   <wp:positionH relativeFrom="column">
                     <wp:posOffset>-68580</wp:posOffset>
@@ -6409,13 +6436,7 @@
       </w:r>
       <w:proofErr w:type="spellEnd"/>
       <w:r>
-        <w:t xml:space="preserve">.  </w:t>
-      </w:r>
-      <w:r>
-        <w:t>Utilizar la siguiente</w:t>
-      </w:r>
-      <w:r>
-        <w:t xml:space="preserve"> clasificación:</w:t>
+        <w:t>.  Utilizar la siguiente clasificación:</w:t>
       </w:r>
     </w:p>
     <w:p>
@@ -6456,10 +6477,7 @@
         </w:numPr>
       </w:pPr>
       <w:r>
-        <w:t>Total,</w:t>
-      </w:r>
-      <w:r>
-        <w:t xml:space="preserve"> de motores evaluados.</w:t>
+        <w:t>Total, de motores evaluados.</w:t>
       </w:r>
     </w:p>
     <w:p>
@@ -7264,6 +7282,9 @@
         </mc:AlternateContent>
       </w:r>
       <w:r>
+        <w:rPr>
+          <w:noProof/>
+        </w:rPr>
         <w:drawing>
           <wp:anchor distT="0" distB="0" distL="114300" distR="114300" simplePos="0" relativeHeight="251782144" behindDoc="0" locked="0" layoutInCell="1" allowOverlap="1" wp14:anchorId="3A19FED8" wp14:editId="679F27B2">
             <wp:simplePos x="0" y="0"/>
@@ -7523,6 +7544,9 @@
         </mc:AlternateContent>
       </w:r>
       <w:r>
+        <w:rPr>
+          <w:noProof/>
+        </w:rPr>
         <w:drawing>
           <wp:anchor distT="0" distB="0" distL="114300" distR="114300" simplePos="0" relativeHeight="251771904" behindDoc="0" locked="0" layoutInCell="1" allowOverlap="1" wp14:anchorId="4C31217D" wp14:editId="0EB46C6E">
             <wp:simplePos x="0" y="0"/>
@@ -7854,8 +7878,11 @@
               </mc:AlternateContent>
             </w:r>
             <w:r>
+              <w:rPr>
+                <w:noProof/>
+              </w:rPr>
               <w:drawing>
-                <wp:anchor distT="0" distB="0" distL="114300" distR="114300" simplePos="0" relativeHeight="251774976" behindDoc="0" locked="0" layoutInCell="1" allowOverlap="1" wp14:anchorId="295C3735" wp14:editId="5C03196E">
+                <wp:anchor distT="0" distB="0" distL="114300" distR="114300" simplePos="0" relativeHeight="251774976" behindDoc="0" locked="0" layoutInCell="1" allowOverlap="1" wp14:anchorId="295C3735" wp14:editId="5733D3B8">
                   <wp:simplePos x="0" y="0"/>
                   <wp:positionH relativeFrom="column">
                     <wp:posOffset>-68580</wp:posOffset>
@@ -8222,6 +8249,595 @@
         <w:t>.</w:t>
       </w:r>
     </w:p>
+    <w:p>
+      <w:pPr>
+        <w:spacing w:line="278" w:lineRule="auto"/>
+        <w:jc w:val="left"/>
+      </w:pPr>
+      <w:r>
+        <w:br w:type="page"/>
+      </w:r>
+    </w:p>
+    <w:p>
+      <w:pPr>
+        <w:pStyle w:val="Ttulo2"/>
+      </w:pPr>
+      <w:r>
+        <w:lastRenderedPageBreak/>
+        <w:t>Anexos.</w:t>
+      </w:r>
+    </w:p>
+    <w:p>
+      <w:r>
+        <w:rPr>
+          <w:noProof/>
+        </w:rPr>
+        <mc:AlternateContent>
+          <mc:Choice Requires="wps">
+            <w:drawing>
+              <wp:anchor distT="0" distB="0" distL="114300" distR="114300" simplePos="0" relativeHeight="251809792" behindDoc="0" locked="0" layoutInCell="1" allowOverlap="1" wp14:anchorId="61B68B62" wp14:editId="1D782EF5">
+                <wp:simplePos x="0" y="0"/>
+                <wp:positionH relativeFrom="column">
+                  <wp:posOffset>0</wp:posOffset>
+                </wp:positionH>
+                <wp:positionV relativeFrom="paragraph">
+                  <wp:posOffset>3477318</wp:posOffset>
+                </wp:positionV>
+                <wp:extent cx="5612130" cy="635"/>
+                <wp:effectExtent l="0" t="0" r="7620" b="0"/>
+                <wp:wrapTopAndBottom/>
+                <wp:docPr id="1803294043" name="Cuadro de texto 1"/>
+                <wp:cNvGraphicFramePr/>
+                <a:graphic xmlns:a="http://schemas.openxmlformats.org/drawingml/2006/main">
+                  <a:graphicData uri="http://schemas.microsoft.com/office/word/2010/wordprocessingShape">
+                    <wps:wsp>
+                      <wps:cNvSpPr txBox="1"/>
+                      <wps:spPr>
+                        <a:xfrm>
+                          <a:off x="0" y="0"/>
+                          <a:ext cx="5612130" cy="635"/>
+                        </a:xfrm>
+                        <a:prstGeom prst="rect">
+                          <a:avLst/>
+                        </a:prstGeom>
+                        <a:solidFill>
+                          <a:prstClr val="white"/>
+                        </a:solidFill>
+                        <a:ln>
+                          <a:noFill/>
+                        </a:ln>
+                      </wps:spPr>
+                      <wps:txbx>
+                        <w:txbxContent>
+                          <w:p>
+                            <w:pPr>
+                              <w:pStyle w:val="Descripcin"/>
+                            </w:pPr>
+                            <w:r>
+                              <w:rPr>
+                                <w:b/>
+                                <w:bCs/>
+                              </w:rPr>
+                              <w:t xml:space="preserve">Fig. </w:t>
+                            </w:r>
+                            <w:r>
+                              <w:rPr>
+                                <w:b/>
+                                <w:bCs/>
+                              </w:rPr>
+                              <w:fldChar w:fldCharType="begin"/>
+                            </w:r>
+                            <w:r>
+                              <w:rPr>
+                                <w:b/>
+                                <w:bCs/>
+                              </w:rPr>
+                              <w:instrText xml:space="preserve"> SEQ Fig. \* ARABIC </w:instrText>
+                            </w:r>
+                            <w:r>
+                              <w:rPr>
+                                <w:b/>
+                                <w:bCs/>
+                              </w:rPr>
+                              <w:fldChar w:fldCharType="separate"/>
+                            </w:r>
+                            <w:r>
+                              <w:rPr>
+                                <w:b/>
+                                <w:bCs/>
+                                <w:noProof/>
+                              </w:rPr>
+                              <w:t>29</w:t>
+                            </w:r>
+                            <w:r>
+                              <w:rPr>
+                                <w:b/>
+                                <w:bCs/>
+                              </w:rPr>
+                              <w:fldChar w:fldCharType="end"/>
+                            </w:r>
+                            <w:r>
+                              <w:rPr>
+                                <w:b/>
+                                <w:bCs/>
+                              </w:rPr>
+                              <w:t xml:space="preserve">: </w:t>
+                            </w:r>
+                            <w:r>
+                              <w:t>Ejercicios hechos en clase (E1-E4) y ejercicios del problemario dentro de la carpeta que dice: "Problemario", además del reporte.</w:t>
+                            </w:r>
+                          </w:p>
+                        </w:txbxContent>
+                      </wps:txbx>
+                      <wps:bodyPr rot="0" spcFirstLastPara="0" vertOverflow="overflow" horzOverflow="overflow" vert="horz" wrap="square" lIns="0" tIns="0" rIns="0" bIns="0" numCol="1" spcCol="0" rtlCol="0" fromWordArt="0" anchor="t" anchorCtr="0" forceAA="0" compatLnSpc="1">
+                        <a:prstTxWarp prst="textNoShape">
+                          <a:avLst/>
+                        </a:prstTxWarp>
+                        <a:spAutoFit/>
+                      </wps:bodyPr>
+                    </wps:wsp>
+                  </a:graphicData>
+                </a:graphic>
+              </wp:anchor>
+            </w:drawing>
+          </mc:Choice>
+          <mc:Fallback>
+            <w:pict>
+              <v:shape w14:anchorId="61B68B62" id="_x0000_s1053" type="#_x0000_t202" style="position:absolute;left:0;text-align:left;margin-left:0;margin-top:273.8pt;width:441.9pt;height:.05pt;z-index:251809792;visibility:visible;mso-wrap-style:square;mso-wrap-distance-left:9pt;mso-wrap-distance-top:0;mso-wrap-distance-right:9pt;mso-wrap-distance-bottom:0;mso-position-horizontal:absolute;mso-position-horizontal-relative:text;mso-position-vertical:absolute;mso-position-vertical-relative:text;v-text-anchor:top" o:gfxdata="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" stroked="f">
+                <v:textbox style="mso-fit-shape-to-text:t" inset="0,0,0,0">
+                  <w:txbxContent>
+                    <w:p>
+                      <w:pPr>
+                        <w:pStyle w:val="Descripcin"/>
+                      </w:pPr>
+                      <w:r>
+                        <w:rPr>
+                          <w:b/>
+                          <w:bCs/>
+                        </w:rPr>
+                        <w:t xml:space="preserve">Fig. </w:t>
+                      </w:r>
+                      <w:r>
+                        <w:rPr>
+                          <w:b/>
+                          <w:bCs/>
+                        </w:rPr>
+                        <w:fldChar w:fldCharType="begin"/>
+                      </w:r>
+                      <w:r>
+                        <w:rPr>
+                          <w:b/>
+                          <w:bCs/>
+                        </w:rPr>
+                        <w:instrText xml:space="preserve"> SEQ Fig. \* ARABIC </w:instrText>
+                      </w:r>
+                      <w:r>
+                        <w:rPr>
+                          <w:b/>
+                          <w:bCs/>
+                        </w:rPr>
+                        <w:fldChar w:fldCharType="separate"/>
+                      </w:r>
+                      <w:r>
+                        <w:rPr>
+                          <w:b/>
+                          <w:bCs/>
+                          <w:noProof/>
+                        </w:rPr>
+                        <w:t>29</w:t>
+                      </w:r>
+                      <w:r>
+                        <w:rPr>
+                          <w:b/>
+                          <w:bCs/>
+                        </w:rPr>
+                        <w:fldChar w:fldCharType="end"/>
+                      </w:r>
+                      <w:r>
+                        <w:rPr>
+                          <w:b/>
+                          <w:bCs/>
+                        </w:rPr>
+                        <w:t xml:space="preserve">: </w:t>
+                      </w:r>
+                      <w:r>
+                        <w:t>Ejercicios hechos en clase (E1-E4) y ejercicios del problemario dentro de la carpeta que dice: "Problemario", además del reporte.</w:t>
+                      </w:r>
+                    </w:p>
+                  </w:txbxContent>
+                </v:textbox>
+                <w10:wrap type="topAndBottom"/>
+              </v:shape>
+            </w:pict>
+          </mc:Fallback>
+        </mc:AlternateContent>
+      </w:r>
+      <w:r>
+        <w:drawing>
+          <wp:anchor distT="0" distB="0" distL="114300" distR="114300" simplePos="0" relativeHeight="251805696" behindDoc="0" locked="0" layoutInCell="1" allowOverlap="1" wp14:anchorId="2804C92B" wp14:editId="695B7FB5">
+            <wp:simplePos x="0" y="0"/>
+            <wp:positionH relativeFrom="margin">
+              <wp:align>left</wp:align>
+            </wp:positionH>
+            <wp:positionV relativeFrom="paragraph">
+              <wp:posOffset>2021205</wp:posOffset>
+            </wp:positionV>
+            <wp:extent cx="5612130" cy="1398905"/>
+            <wp:effectExtent l="0" t="0" r="7620" b="0"/>
+            <wp:wrapTopAndBottom/>
+            <wp:docPr id="626250564" name="Imagen 1"/>
+            <wp:cNvGraphicFramePr>
+              <a:graphicFrameLocks xmlns:a="http://schemas.openxmlformats.org/drawingml/2006/main" noChangeAspect="1"/>
+            </wp:cNvGraphicFramePr>
+            <a:graphic xmlns:a="http://schemas.openxmlformats.org/drawingml/2006/main">
+              <a:graphicData uri="http://schemas.openxmlformats.org/drawingml/2006/picture">
+                <pic:pic xmlns:pic="http://schemas.openxmlformats.org/drawingml/2006/picture">
+                  <pic:nvPicPr>
+                    <pic:cNvPr id="626250564" name=""/>
+                    <pic:cNvPicPr/>
+                  </pic:nvPicPr>
+                  <pic:blipFill>
+                    <a:blip r:embed="rId31"/>
+                    <a:stretch>
+                      <a:fillRect/>
+                    </a:stretch>
+                  </pic:blipFill>
+                  <pic:spPr>
+                    <a:xfrm>
+                      <a:off x="0" y="0"/>
+                      <a:ext cx="5612130" cy="1398905"/>
+                    </a:xfrm>
+                    <a:prstGeom prst="rect">
+                      <a:avLst/>
+                    </a:prstGeom>
+                  </pic:spPr>
+                </pic:pic>
+              </a:graphicData>
+            </a:graphic>
+          </wp:anchor>
+        </w:drawing>
+      </w:r>
+      <w:r>
+        <w:rPr>
+          <w:noProof/>
+        </w:rPr>
+        <mc:AlternateContent>
+          <mc:Choice Requires="wps">
+            <w:drawing>
+              <wp:anchor distT="0" distB="0" distL="114300" distR="114300" simplePos="0" relativeHeight="251807744" behindDoc="0" locked="0" layoutInCell="1" allowOverlap="1" wp14:anchorId="62AAD280" wp14:editId="18BBDC20">
+                <wp:simplePos x="0" y="0"/>
+                <wp:positionH relativeFrom="column">
+                  <wp:posOffset>-7620</wp:posOffset>
+                </wp:positionH>
+                <wp:positionV relativeFrom="paragraph">
+                  <wp:posOffset>1654175</wp:posOffset>
+                </wp:positionV>
+                <wp:extent cx="5612130" cy="635"/>
+                <wp:effectExtent l="0" t="0" r="0" b="0"/>
+                <wp:wrapSquare wrapText="bothSides"/>
+                <wp:docPr id="996515898" name="Cuadro de texto 1"/>
+                <wp:cNvGraphicFramePr/>
+                <a:graphic xmlns:a="http://schemas.openxmlformats.org/drawingml/2006/main">
+                  <a:graphicData uri="http://schemas.microsoft.com/office/word/2010/wordprocessingShape">
+                    <wps:wsp>
+                      <wps:cNvSpPr txBox="1"/>
+                      <wps:spPr>
+                        <a:xfrm>
+                          <a:off x="0" y="0"/>
+                          <a:ext cx="5612130" cy="635"/>
+                        </a:xfrm>
+                        <a:prstGeom prst="rect">
+                          <a:avLst/>
+                        </a:prstGeom>
+                        <a:solidFill>
+                          <a:prstClr val="white"/>
+                        </a:solidFill>
+                        <a:ln>
+                          <a:noFill/>
+                        </a:ln>
+                      </wps:spPr>
+                      <wps:txbx>
+                        <w:txbxContent>
+                          <w:p>
+                            <w:pPr>
+                              <w:pStyle w:val="Descripcin"/>
+                            </w:pPr>
+                            <w:r>
+                              <w:rPr>
+                                <w:b/>
+                                <w:bCs/>
+                              </w:rPr>
+                              <w:t xml:space="preserve">Fig. </w:t>
+                            </w:r>
+                            <w:r>
+                              <w:rPr>
+                                <w:b/>
+                                <w:bCs/>
+                              </w:rPr>
+                              <w:fldChar w:fldCharType="begin"/>
+                            </w:r>
+                            <w:r>
+                              <w:rPr>
+                                <w:b/>
+                                <w:bCs/>
+                              </w:rPr>
+                              <w:instrText xml:space="preserve"> SEQ Fig. \* ARABIC </w:instrText>
+                            </w:r>
+                            <w:r>
+                              <w:rPr>
+                                <w:b/>
+                                <w:bCs/>
+                              </w:rPr>
+                              <w:fldChar w:fldCharType="separate"/>
+                            </w:r>
+                            <w:r>
+                              <w:rPr>
+                                <w:b/>
+                                <w:bCs/>
+                                <w:noProof/>
+                              </w:rPr>
+                              <w:t>28</w:t>
+                            </w:r>
+                            <w:r>
+                              <w:rPr>
+                                <w:b/>
+                                <w:bCs/>
+                              </w:rPr>
+                              <w:fldChar w:fldCharType="end"/>
+                            </w:r>
+                            <w:r>
+                              <w:rPr>
+                                <w:b/>
+                                <w:bCs/>
+                              </w:rPr>
+                              <w:t>:</w:t>
+                            </w:r>
+                            <w:r>
+                              <w:t xml:space="preserve"> </w:t>
+                            </w:r>
+                            <w:r>
+                              <w:t>Carpeta de Unidad 1.</w:t>
+                            </w:r>
+                          </w:p>
+                        </w:txbxContent>
+                      </wps:txbx>
+                      <wps:bodyPr rot="0" spcFirstLastPara="0" vertOverflow="overflow" horzOverflow="overflow" vert="horz" wrap="square" lIns="0" tIns="0" rIns="0" bIns="0" numCol="1" spcCol="0" rtlCol="0" fromWordArt="0" anchor="t" anchorCtr="0" forceAA="0" compatLnSpc="1">
+                        <a:prstTxWarp prst="textNoShape">
+                          <a:avLst/>
+                        </a:prstTxWarp>
+                        <a:spAutoFit/>
+                      </wps:bodyPr>
+                    </wps:wsp>
+                  </a:graphicData>
+                </a:graphic>
+              </wp:anchor>
+            </w:drawing>
+          </mc:Choice>
+          <mc:Fallback>
+            <w:pict>
+              <v:shape w14:anchorId="62AAD280" id="_x0000_s1054" type="#_x0000_t202" style="position:absolute;left:0;text-align:left;margin-left:-.6pt;margin-top:130.25pt;width:441.9pt;height:.05pt;z-index:251807744;visibility:visible;mso-wrap-style:square;mso-wrap-distance-left:9pt;mso-wrap-distance-top:0;mso-wrap-distance-right:9pt;mso-wrap-distance-bottom:0;mso-position-horizontal:absolute;mso-position-horizontal-relative:text;mso-position-vertical:absolute;mso-position-vertical-relative:text;v-text-anchor:top" o:gfxdata="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" stroked="f">
+                <v:textbox style="mso-fit-shape-to-text:t" inset="0,0,0,0">
+                  <w:txbxContent>
+                    <w:p>
+                      <w:pPr>
+                        <w:pStyle w:val="Descripcin"/>
+                      </w:pPr>
+                      <w:r>
+                        <w:rPr>
+                          <w:b/>
+                          <w:bCs/>
+                        </w:rPr>
+                        <w:t xml:space="preserve">Fig. </w:t>
+                      </w:r>
+                      <w:r>
+                        <w:rPr>
+                          <w:b/>
+                          <w:bCs/>
+                        </w:rPr>
+                        <w:fldChar w:fldCharType="begin"/>
+                      </w:r>
+                      <w:r>
+                        <w:rPr>
+                          <w:b/>
+                          <w:bCs/>
+                        </w:rPr>
+                        <w:instrText xml:space="preserve"> SEQ Fig. \* ARABIC </w:instrText>
+                      </w:r>
+                      <w:r>
+                        <w:rPr>
+                          <w:b/>
+                          <w:bCs/>
+                        </w:rPr>
+                        <w:fldChar w:fldCharType="separate"/>
+                      </w:r>
+                      <w:r>
+                        <w:rPr>
+                          <w:b/>
+                          <w:bCs/>
+                          <w:noProof/>
+                        </w:rPr>
+                        <w:t>28</w:t>
+                      </w:r>
+                      <w:r>
+                        <w:rPr>
+                          <w:b/>
+                          <w:bCs/>
+                        </w:rPr>
+                        <w:fldChar w:fldCharType="end"/>
+                      </w:r>
+                      <w:r>
+                        <w:rPr>
+                          <w:b/>
+                          <w:bCs/>
+                        </w:rPr>
+                        <w:t>:</w:t>
+                      </w:r>
+                      <w:r>
+                        <w:t xml:space="preserve"> </w:t>
+                      </w:r>
+                      <w:r>
+                        <w:t>Carpeta de Unidad 1.</w:t>
+                      </w:r>
+                    </w:p>
+                  </w:txbxContent>
+                </v:textbox>
+                <w10:wrap type="square"/>
+              </v:shape>
+            </w:pict>
+          </mc:Fallback>
+        </mc:AlternateContent>
+      </w:r>
+      <w:r>
+        <w:drawing>
+          <wp:anchor distT="0" distB="0" distL="114300" distR="114300" simplePos="0" relativeHeight="251803648" behindDoc="0" locked="0" layoutInCell="1" allowOverlap="1" wp14:anchorId="462BC0FF" wp14:editId="0DA6A100">
+            <wp:simplePos x="0" y="0"/>
+            <wp:positionH relativeFrom="margin">
+              <wp:align>right</wp:align>
+            </wp:positionH>
+            <wp:positionV relativeFrom="paragraph">
+              <wp:posOffset>1067435</wp:posOffset>
+            </wp:positionV>
+            <wp:extent cx="5612130" cy="529590"/>
+            <wp:effectExtent l="0" t="0" r="7620" b="3810"/>
+            <wp:wrapSquare wrapText="bothSides"/>
+            <wp:docPr id="821938632" name="Imagen 1"/>
+            <wp:cNvGraphicFramePr>
+              <a:graphicFrameLocks xmlns:a="http://schemas.openxmlformats.org/drawingml/2006/main" noChangeAspect="1"/>
+            </wp:cNvGraphicFramePr>
+            <a:graphic xmlns:a="http://schemas.openxmlformats.org/drawingml/2006/main">
+              <a:graphicData uri="http://schemas.openxmlformats.org/drawingml/2006/picture">
+                <pic:pic xmlns:pic="http://schemas.openxmlformats.org/drawingml/2006/picture">
+                  <pic:nvPicPr>
+                    <pic:cNvPr id="821938632" name=""/>
+                    <pic:cNvPicPr/>
+                  </pic:nvPicPr>
+                  <pic:blipFill>
+                    <a:blip r:embed="rId32">
+                      <a:extLst>
+                        <a:ext uri="{28A0092B-C50C-407E-A947-70E740481C1C}">
+                          <a14:useLocalDpi xmlns:a14="http://schemas.microsoft.com/office/drawing/2010/main" val="0"/>
+                        </a:ext>
+                      </a:extLst>
+                    </a:blip>
+                    <a:stretch>
+                      <a:fillRect/>
+                    </a:stretch>
+                  </pic:blipFill>
+                  <pic:spPr>
+                    <a:xfrm>
+                      <a:off x="0" y="0"/>
+                      <a:ext cx="5612130" cy="529590"/>
+                    </a:xfrm>
+                    <a:prstGeom prst="rect">
+                      <a:avLst/>
+                    </a:prstGeom>
+                  </pic:spPr>
+                </pic:pic>
+              </a:graphicData>
+            </a:graphic>
+          </wp:anchor>
+        </w:drawing>
+      </w:r>
+      <w:r>
+        <w:t xml:space="preserve">Como último </w:t>
+      </w:r>
+      <w:r>
+        <w:t>s</w:t>
+      </w:r>
+      <w:r>
+        <w:t xml:space="preserve">e comparte el </w:t>
+      </w:r>
+      <w:r>
+        <w:t>enlace</w:t>
+      </w:r>
+      <w:r>
+        <w:t xml:space="preserve"> </w:t>
+      </w:r>
+      <w:r>
+        <w:t>de Git, el cual contiene la carpeta de la Unidad 1, como U1</w:t>
+      </w:r>
+      <w:r>
+        <w:t xml:space="preserve"> (Fig. </w:t>
+      </w:r>
+      <w:r>
+        <w:t>28</w:t>
+      </w:r>
+      <w:r>
+        <w:t>)</w:t>
+      </w:r>
+      <w:r>
+        <w:t>, en ello trae las actividades realizadas en clase</w:t>
+      </w:r>
+      <w:r>
+        <w:t xml:space="preserve"> (como E1, E2, E3 y E4)</w:t>
+      </w:r>
+      <w:r>
+        <w:t>.</w:t>
+      </w:r>
+      <w:r>
+        <w:t xml:space="preserve"> </w:t>
+      </w:r>
+      <w:r>
+        <w:t>A</w:t>
+      </w:r>
+      <w:r>
+        <w:t xml:space="preserve">demás de </w:t>
+      </w:r>
+      <w:r>
+        <w:t>una carpeta, nombrada “Problemario”, donde contiene los 5 ejercicios del problemario</w:t>
+      </w:r>
+      <w:r>
+        <w:t xml:space="preserve"> (Fig. 29)</w:t>
+      </w:r>
+      <w:r>
+        <w:t>.</w:t>
+      </w:r>
+      <w:r>
+        <w:t xml:space="preserve"> </w:t>
+      </w:r>
+      <w:r>
+        <w:t xml:space="preserve">Y </w:t>
+      </w:r>
+      <w:r>
+        <w:t xml:space="preserve">también contiene el archivo el archivo editable </w:t>
+      </w:r>
+      <w:r>
+        <w:t>del problemario, en Word, y el documento en PDF.</w:t>
+      </w:r>
+    </w:p>
+    <w:p>
+      <w:r>
+        <w:t xml:space="preserve">Enlace al </w:t>
+      </w:r>
+      <w:r>
+        <w:t>repositorio de Git:</w:t>
+      </w:r>
+    </w:p>
+    <w:p>
+      <w:hyperlink r:id="rId33" w:history="1">
+        <w:r>
+          <w:rPr>
+            <w:rStyle w:val="Hipervnculo"/>
+          </w:rPr>
+          <w:t>https://github.com/Beri-Boo/Progra</w:t>
+        </w:r>
+        <w:r>
+          <w:rPr>
+            <w:rStyle w:val="Hipervnculo"/>
+          </w:rPr>
+          <w:t>m</w:t>
+        </w:r>
+        <w:r>
+          <w:rPr>
+            <w:rStyle w:val="Hipervnculo"/>
+          </w:rPr>
+          <w:t>acion_Avanzada.git</w:t>
+        </w:r>
+      </w:hyperlink>
+    </w:p>
+    <w:p/>
+    <w:p/>
+    <w:p/>
     <w:sectPr>
       <w:pgSz w:w="12240" w:h="15840"/>
       <w:pgMar w:top="1417" w:right="1701" w:bottom="1417" w:left="1701" w:header="708" w:footer="708" w:gutter="0"/>
@@ -10822,6 +11438,7 @@
   <w:style w:type="character" w:default="1" w:styleId="Fuentedeprrafopredeter">
     <w:name w:val="Default Paragraph Font"/>
     <w:uiPriority w:val="1"/>
+    <w:semiHidden/>
     <w:unhideWhenUsed/>
   </w:style>
   <w:style w:type="table" w:default="1" w:styleId="Tablanormal">
@@ -11189,6 +11806,41 @@
       </w:tblBorders>
     </w:tblPr>
   </w:style>
+  <w:style w:type="character" w:styleId="Hipervnculo">
+    <w:name w:val="Hyperlink"/>
+    <w:basedOn w:val="Fuentedeprrafopredeter"/>
+    <w:uiPriority w:val="99"/>
+    <w:unhideWhenUsed/>
+    <w:rsid w:val="00ED3FB6"/>
+    <w:rPr>
+      <w:color w:val="467886" w:themeColor="hyperlink"/>
+      <w:u w:val="single"/>
+    </w:rPr>
+  </w:style>
+  <w:style w:type="character" w:styleId="Mencinsinresolver">
+    <w:name w:val="Unresolved Mention"/>
+    <w:basedOn w:val="Fuentedeprrafopredeter"/>
+    <w:uiPriority w:val="99"/>
+    <w:semiHidden/>
+    <w:unhideWhenUsed/>
+    <w:rsid w:val="00ED3FB6"/>
+    <w:rPr>
+      <w:color w:val="605E5C"/>
+      <w:shd w:val="clear" w:color="auto" w:fill="E1DFDD"/>
+    </w:rPr>
+  </w:style>
+  <w:style w:type="character" w:styleId="Hipervnculovisitado">
+    <w:name w:val="FollowedHyperlink"/>
+    <w:basedOn w:val="Fuentedeprrafopredeter"/>
+    <w:uiPriority w:val="99"/>
+    <w:semiHidden/>
+    <w:unhideWhenUsed/>
+    <w:rsid w:val="00ED3FB6"/>
+    <w:rPr>
+      <w:color w:val="96607D" w:themeColor="followedHyperlink"/>
+      <w:u w:val="single"/>
+    </w:rPr>
+  </w:style>
 </w:styles>
 </file>
 

</xml_diff>